<commit_message>
Add bulk course upload, expand course outlines to full educational depth
- Bulk upload: select multiple PDF/DOCX files, edit course names, processes one by one automatically with per-lesson progress
- Expanded course outlines: 06 (8 lessons), 07 (7 lessons), 08 (8 lessons), 09 (8 lessons), 10 (10 lessons) — 41 lessons total with detailed key points
- Each key point includes specific tools, frameworks, and actionable details for comprehensive education

Co-Authored-By: Claude Opus 4.6 (1M context) <noreply@anthropic.com>
</commit_message>
<xml_diff>
--- a/course-pdfs/06_AI_Business_Leadership.docx
+++ b/course-pdfs/06_AI_Business_Leadership.docx
@@ -25,7 +25,7 @@
       </w:pPr>
       <w:r>
         <w:rPr/>
-        <w:t>Lesson 1: AI-Powered CEO — მართვისა და დელეგირების სისტემა</w:t>
+        <w:t>Lesson 1: AI-Powered CEO — ყოველდღიური მართვის სისტემა</w:t>
       </w:r>
     </w:p>
     <w:p>
@@ -46,7 +46,7 @@
       </w:pPr>
       <w:r>
         <w:rPr/>
-        <w:t>AI გადაწყვეტილების მიღების ფრეიმვორკები (OODA ციკლი AI-ით)</w:t>
+        <w:t>AI გადაწყვეტილების მიღების OODA ფრეიმვორკი: Observe (Perplexity AI, Feedly AI-ით მონაცემების შეგროვება), Orient (Claude/GPT-4-ით კონტექსტური ანალიზი), Decide (SWOT + რისკის მატრიცა AI-ით), Act (Make.com/Zapier-ით ავტომატური ქმედებები)</w:t>
       </w:r>
     </w:p>
     <w:p>
@@ -67,7 +67,7 @@
       </w:pPr>
       <w:r>
         <w:rPr/>
-        <w:t>მონაცემებზე დაფუძნებული ლიდერობა vs ინტუიცია</w:t>
+        <w:t>ყოველდღიური AI ბრიფინგის სისტემა: Google Alerts + ChatGPT კომბინაცია, პრომპტ-შაბლონი დილის ბრიფინგისთვის (TOP 3 სიახლე, საფრთხეები, შესაძლებლობები, კონკრეტული ქმედება), Perplexity AI Pro ინდუსტრიის მონიტორინგისთვის</w:t>
       </w:r>
     </w:p>
     <w:p>
@@ -88,7 +88,7 @@
       </w:pPr>
       <w:r>
         <w:rPr/>
-        <w:t>AI ინსტრუმენტები CEO-სთვის: Perplexity, Feedly AI, Claude</w:t>
+        <w:t>კოგნიტური მიკერძოებების გამოვლენა: confirmation bias, anchoring bias, sunk cost fallacy — Kahneman-ის System 1/System 2 ფრეიმვორკი, AI როგორც System 2 გამაძლიერებელი, პრომპტი მიკერძოების შესამოწმებლად</w:t>
       </w:r>
     </w:p>
     <w:p>
@@ -109,7 +109,7 @@
       </w:pPr>
       <w:r>
         <w:rPr/>
-        <w:t>ყოველდღიური AI ბრიფინგის სისტემის აწყობა</w:t>
+        <w:t>AI დელეგირების სისტემა: ელ-ფოსტის კატეგორიზაცია და პრიორიტიზაცია, შეხვედრების შეჯამება (Otter.ai, Fireflies.ai), დავალებების ავტომატური შექმნა Asana/Notion-ში, კვირის რეტროსპექტივა AI-ით</w:t>
       </w:r>
     </w:p>
     <w:p>
@@ -130,19 +130,19 @@
       </w:pPr>
       <w:r>
         <w:rPr/>
-        <w:t>გუნდისთვის დავალებების დელეგირება AI ასისტენტის დახმარებით</w:t>
-      </w:r>
-    </w:p>
-    <w:p>
-      <w:pPr>
-        <w:pStyle w:val="BodyText"/>
-        <w:bidi w:val="0"/>
-        <w:jc w:val="start"/>
-        <w:rPr/>
-      </w:pPr>
-      <w:r>
-        <w:rPr/>
-        <w:t>Lesson 2: AI Business Automation — პროცესების რობოტიზაცია</w:t>
+        <w:t>მონაცემები vs ინტუიცია: ბალანსის მოდელი — როდის ენდო AI-ს და როდის ინტუიციას, გადაწყვეტილებების ჟურნალის წარმოება AI-ით, 360-გრადუსიანი ანალიზის პრომპტ-შაბლონი</w:t>
+      </w:r>
+    </w:p>
+    <w:p>
+      <w:pPr>
+        <w:pStyle w:val="BodyText"/>
+        <w:bidi w:val="0"/>
+        <w:jc w:val="start"/>
+        <w:rPr/>
+      </w:pPr>
+      <w:r>
+        <w:rPr/>
+        <w:t>Lesson 2: AI ბიზნეს-კომუნიკაცია და პროდუქტიულობა</w:t>
       </w:r>
     </w:p>
     <w:p>
@@ -163,7 +163,7 @@
       </w:pPr>
       <w:r>
         <w:rPr/>
-        <w:t>ბიზნეს-პროცესების ავტომატიზაციის საფუძვლები</w:t>
+        <w:t>ელ-ფოსტის მართვა AI-ით: Gmail/Outlook + AI კლასიფიკაცია, ავტომატური პასუხების შაბლონები სიტუაციების მიხედვით, follow-up სეკვენციები, email delegation workflow, inbox zero სტრატეგია AI-ით</w:t>
       </w:r>
     </w:p>
     <w:p>
@@ -184,7 +184,7 @@
       </w:pPr>
       <w:r>
         <w:rPr/>
-        <w:t>Make.com და Zapier: ავტომატური workflow-ების აწყობა</w:t>
+        <w:t>შეხვედრების ოპტიმიზაცია: დღის წესრიგის ავტომატური გენერაცია (წინა შეხვედრის შეჯამება + მიმდინარე საკითხები), meeting notes AI-ით, action items ავტომატური ექსტრაქცია და მინიჭება, შეხვედრის ეფექტურობის მეტრიკა</w:t>
       </w:r>
     </w:p>
     <w:p>
@@ -205,7 +205,7 @@
       </w:pPr>
       <w:r>
         <w:rPr/>
-        <w:t>ელ-ფოსტის, დოკუმენტების და ანგარიშების ავტომატიზაცია</w:t>
+        <w:t>პრეზენტაციები და ანგარიშები: Gamma AI / Tome / Beautiful.ai-ით პრეზენტაციის გენერაცია, მონაცემების ვიზუალიზაცია, executive summary ავტომატური შექმნა, board report-ის სტრუქტურა AI-ით</w:t>
       </w:r>
     </w:p>
     <w:p>
@@ -226,7 +226,7 @@
       </w:pPr>
       <w:r>
         <w:rPr/>
-        <w:t>CRM და გაყიდვების პროცესების ავტომატიზაცია</w:t>
+        <w:t>შიდა კომუნიკაციის ავტომატიზაცია: Slack/Teams ბოტები ხშირ კითხვებზე პასუხისთვის, company newsletter ავტომატური კურატორება, onboarding მესიჯების სეკვენცია, crisis communication შაბლონები</w:t>
       </w:r>
     </w:p>
     <w:p>
@@ -247,19 +247,19 @@
       </w:pPr>
       <w:r>
         <w:rPr/>
-        <w:t>ROI გამოთვლა: ავტომატიზაციის ეფექტის გაზომვა</w:t>
-      </w:r>
-    </w:p>
-    <w:p>
-      <w:pPr>
-        <w:pStyle w:val="BodyText"/>
-        <w:bidi w:val="0"/>
-        <w:jc w:val="start"/>
-        <w:rPr/>
-      </w:pPr>
-      <w:r>
-        <w:rPr/>
-        <w:t>Lesson 3: AI Financial Intelligence — ბუღალტერია და ფინანსური ანალიზი</w:t>
+        <w:t>დროის მართვა AI-ით: კალენდრის ოპტიმიზაცია (Reclaim.ai, Clockwise), deep work ბლოკების ავტომატური დაგეგმვა, meeting-free days, პრიორიტიზაციის Eisenhower მატრიცა AI-ით</w:t>
+      </w:r>
+    </w:p>
+    <w:p>
+      <w:pPr>
+        <w:pStyle w:val="BodyText"/>
+        <w:bidi w:val="0"/>
+        <w:jc w:val="start"/>
+        <w:rPr/>
+      </w:pPr>
+      <w:r>
+        <w:rPr/>
+        <w:t>Lesson 3: AI Business Automation — პროცესების ავტომატიზაცია</w:t>
       </w:r>
     </w:p>
     <w:p>
@@ -280,7 +280,7 @@
       </w:pPr>
       <w:r>
         <w:rPr/>
-        <w:t>AI ფინანსური ანალიზის ინსტრუმენტები</w:t>
+        <w:t>ავტომატიზაციის აუდიტი: როგორ გამოავლინო ავტომატიზირებადი პროცესები, ROI გამოთვლის ფორმულა (დაზოგილი საათები × ღირებულება - ინსტრუმენტის ფასი), პრიორიტიზაციის მატრიცა (impact vs effort), ავტომატიზაციის roadmap</w:t>
       </w:r>
     </w:p>
     <w:p>
@@ -301,7 +301,7 @@
       </w:pPr>
       <w:r>
         <w:rPr/>
-        <w:t>ბიუჯეტის დაგეგმვა და cashflow პროგნოზირება AI-ით</w:t>
+        <w:t>Make.com სრული სახელმძღვანელო: ტრიგერები, მოქმედებები, ფილტრები, router, iterator — პირველი workflow-ს აწყობა, 5 რეალური სცენარი (ლიდის დამუშავება, ანგარიშის გენერაცია, კლიენტის შეტყობინება, ინვოისის შექმნა, სოციალური მედია)</w:t>
       </w:r>
     </w:p>
     <w:p>
@@ -322,7 +322,7 @@
       </w:pPr>
       <w:r>
         <w:rPr/>
-        <w:t>ფინანსური ანგარიშების ავტომატური გენერაცია</w:t>
+        <w:t>Zapier სრული სახელმძღვანელო: multi-step Zaps, Paths, Formatter, Zapier Tables, Zapier Interfaces — Make.com vs Zapier შედარება (ფასი, სირთულე, ინტეგრაციები), მიგრაცია ერთიდან მეორეზე</w:t>
       </w:r>
     </w:p>
     <w:p>
@@ -343,7 +343,7 @@
       </w:pPr>
       <w:r>
         <w:rPr/>
-        <w:t>ხარჯების ოპტიმიზაცია და ანომალიების გამოვლენა</w:t>
+        <w:t>დოკუმენტების ავტომატიზაცია: კონტრაქტების ავტომატური გენერაცია, ხელმოწერის პროცესი (DocuSign + Zapier), ანგარიშების შექმნა Google Sheets/Looker-დან, invoice workflow, ხარისხის კონტროლი</w:t>
       </w:r>
     </w:p>
     <w:p>
@@ -364,19 +364,19 @@
       </w:pPr>
       <w:r>
         <w:rPr/>
-        <w:t>საინვესტიციო გადაწყვეტილებების მხარდაჭერა AI-ით</w:t>
-      </w:r>
-    </w:p>
-    <w:p>
-      <w:pPr>
-        <w:pStyle w:val="BodyText"/>
-        <w:bidi w:val="0"/>
-        <w:jc w:val="start"/>
-        <w:rPr/>
-      </w:pPr>
-      <w:r>
-        <w:rPr/>
-        <w:t>Lesson 4: AI HR &amp; Talent Management — გუნდის შერჩევა და განვითარება</w:t>
+        <w:t>მულტი-სისტემური workflow-ები: CRM → Email → Slack → Sheets → Invoice ჯაჭვი, error handling და notification, execution monitoring, cost optimization, workflow documentation საუკეთესო პრაქტიკა</w:t>
+      </w:r>
+    </w:p>
+    <w:p>
+      <w:pPr>
+        <w:pStyle w:val="BodyText"/>
+        <w:bidi w:val="0"/>
+        <w:jc w:val="start"/>
+        <w:rPr/>
+      </w:pPr>
+      <w:r>
+        <w:rPr/>
+        <w:t>Lesson 4: AI Financial Intelligence — ფინანსური დაგეგმვა</w:t>
       </w:r>
     </w:p>
     <w:p>
@@ -397,7 +397,7 @@
       </w:pPr>
       <w:r>
         <w:rPr/>
-        <w:t>AI-ით რეკრუტინგის ოპტიმიზაცია</w:t>
+        <w:t>AI ფინანსური ინსტრუმენტები: Runway Financial (სცენარების მოდელირება), Cube (FP&amp;A ავტომატიზაცია), Fathom (ფინანსური ანალიტიკა), QuickBooks AI, Xero AI — თითოეულის შედარება, ფასი, საუკეთესო გამოყენება</w:t>
       </w:r>
     </w:p>
     <w:p>
@@ -418,7 +418,7 @@
       </w:pPr>
       <w:r>
         <w:rPr/>
-        <w:t>კანდიდატების სკრინინგი და შეფასება AI ხელსაწყოებით</w:t>
+        <w:t>Cashflow პროგნოზირება: ისტორიული მონაცემების ანალიზი AI-ით, სეზონურობის გათვალისწინება, 3 სცენარის მოდელირება (ოპტიმისტური/პესიმისტური/რეალისტური), ChatGPT პრომპტ-შაბლონი cashflow ანალიზისთვის, weekly cashflow review სისტემა</w:t>
       </w:r>
     </w:p>
     <w:p>
@@ -439,7 +439,7 @@
       </w:pPr>
       <w:r>
         <w:rPr/>
-        <w:t>თანამშრომლების ჩართულობის ანალიზი</w:t>
+        <w:t>ხარჯების ოპტიმიზაცია: ანომალიების ავტომატური გამოვლენა, კატეგორიზაცია AI-ით, დუბლირებული SaaS სერვისების იდენტიფიკაცია, vendor negotiation მხარდაჭერა AI-ით, cost reduction roadmap</w:t>
       </w:r>
     </w:p>
     <w:p>
@@ -460,7 +460,7 @@
       </w:pPr>
       <w:r>
         <w:rPr/>
-        <w:t>ტრენინგისა და განვითარების პროგრამების პერსონალიზაცია</w:t>
+        <w:t>ფინანსური ანგარიშების ავტომატიზაცია: P&amp;L, Balance Sheet, Cash Flow Statement — AI-ით კომენტარების და ინსაითების დამატება, ვიზუალიზაცია ავტომატურად, board-ready report-ის გენერაცია</w:t>
       </w:r>
     </w:p>
     <w:p>
@@ -481,19 +481,19 @@
       </w:pPr>
       <w:r>
         <w:rPr/>
-        <w:t>კადრების შენარჩუნების პროგნოზირება AI-ით</w:t>
-      </w:r>
-    </w:p>
-    <w:p>
-      <w:pPr>
-        <w:pStyle w:val="BodyText"/>
-        <w:bidi w:val="0"/>
-        <w:jc w:val="start"/>
-        <w:rPr/>
-      </w:pPr>
-      <w:r>
-        <w:rPr/>
-        <w:t>Lesson 5: AI Strategy &amp; Risk Planning — სტრატეგიული დაგეგმარება</w:t>
+        <w:t>საინვესტიციო ანალიზი: კონკურენტების ფინანსური ანალიზი AI-ით, ბაზრის ტრენდების პროგნოზირება, due diligence checklist ავტომატიზაცია, რისკის შეფასების მოდელები, M&amp;A preliminary analysis</w:t>
+      </w:r>
+    </w:p>
+    <w:p>
+      <w:pPr>
+        <w:pStyle w:val="BodyText"/>
+        <w:bidi w:val="0"/>
+        <w:jc w:val="start"/>
+        <w:rPr/>
+      </w:pPr>
+      <w:r>
+        <w:rPr/>
+        <w:t>Lesson 5: AI HR — რეკრუტინგი და ტალანტების მოზიდვა</w:t>
       </w:r>
     </w:p>
     <w:p>
@@ -514,7 +514,7 @@
       </w:pPr>
       <w:r>
         <w:rPr/>
-        <w:t>კონკურენტული ანალიზი AI-ით</w:t>
+        <w:t>ვაკანსიის შექმნა AI-ით: job description გენერაცია Claude-ით (role, responsibilities, requirements, benefits), inclusive language check, competitive compensation research, job posting optimization სხვადასხვა პლატფორმისთვის</w:t>
       </w:r>
     </w:p>
     <w:p>
@@ -535,7 +535,7 @@
       </w:pPr>
       <w:r>
         <w:rPr/>
-        <w:t>ბაზრის ტრენდების პროგნოზირება</w:t>
+        <w:t>კანდიდატების sourcing: LinkedIn Recruiter + AI search, Boolean search ოპტიმიზაცია, talent pool building, passive candidate outreach სეკვენციები AI-ით, diversity sourcing სტრატეგიები</w:t>
       </w:r>
     </w:p>
     <w:p>
@@ -556,7 +556,7 @@
       </w:pPr>
       <w:r>
         <w:rPr/>
-        <w:t>SWOT და PESTEL ანალიზი AI ასისტენტით</w:t>
+        <w:t>რეზიუმეების სკრინინგი: AI-based resume screening (Lever, Greenhouse), scoring criteria-ს აწყობა, bias-free screening practices, red flag detection, skills-based hiring approach</w:t>
       </w:r>
     </w:p>
     <w:p>
@@ -577,7 +577,7 @@
       </w:pPr>
       <w:r>
         <w:rPr/>
-        <w:t>რისკების მართვა და კრიზისის დაგეგმვა</w:t>
+        <w:t>ინტერვიუს პროცესი: structured interview კითხვების გენერაცია პოზიციის მიხედვით, scorecard-ის შექმნა, behavioral interview (STAR method) AI-ით, technical assessment automation, reference check ავტომატიზაცია</w:t>
       </w:r>
     </w:p>
     <w:p>
@@ -598,7 +598,358 @@
       </w:pPr>
       <w:r>
         <w:rPr/>
-        <w:t>AI სტრატეგიის როუდმეპის შექმნა კომპანიისთვის</w:t>
+        <w:t>ონბორდინგი: 30-60-90 დღის ონბორდინგ გეგმის გენერაცია, welcome package ავტომატიზაცია, buddy system matching, first week checklist, onboarding feedback automation</w:t>
+      </w:r>
+    </w:p>
+    <w:p>
+      <w:pPr>
+        <w:pStyle w:val="BodyText"/>
+        <w:bidi w:val="0"/>
+        <w:jc w:val="start"/>
+        <w:rPr/>
+      </w:pPr>
+      <w:r>
+        <w:rPr/>
+        <w:t>Lesson 6: AI HR — თანამშრომლების მართვა და განვითარება</w:t>
+      </w:r>
+    </w:p>
+    <w:p>
+      <w:pPr>
+        <w:pStyle w:val="BodyText"/>
+        <w:numPr>
+          <w:ilvl w:val="0"/>
+          <w:numId w:val="7"/>
+        </w:numPr>
+        <w:tabs>
+          <w:tab w:val="clear" w:pos="709"/>
+          <w:tab w:val="left" w:pos="709" w:leader="none"/>
+        </w:tabs>
+        <w:bidi w:val="0"/>
+        <w:ind w:hanging="283" w:start="709"/>
+        <w:jc w:val="start"/>
+        <w:rPr/>
+      </w:pPr>
+      <w:r>
+        <w:rPr/>
+        <w:t>ჩართულობის მართვა: პულს-გამოკითხვების ანალიზი AI-ით (Culture Amp, Lattice, 15Five), sentiment analysis, early warning სიგნალები, engagement action plan გენერაცია, 1:1 შეხვედრების ოპტიმიზაცია AI-ით</w:t>
+      </w:r>
+    </w:p>
+    <w:p>
+      <w:pPr>
+        <w:pStyle w:val="BodyText"/>
+        <w:numPr>
+          <w:ilvl w:val="0"/>
+          <w:numId w:val="7"/>
+        </w:numPr>
+        <w:tabs>
+          <w:tab w:val="clear" w:pos="709"/>
+          <w:tab w:val="left" w:pos="709" w:leader="none"/>
+        </w:tabs>
+        <w:bidi w:val="0"/>
+        <w:ind w:hanging="283" w:start="709"/>
+        <w:jc w:val="start"/>
+        <w:rPr/>
+      </w:pPr>
+      <w:r>
+        <w:rPr/>
+        <w:t>Performance Management: goal setting (OKR) AI-ით, continuous feedback სისტემა, performance review-ს ავტომატიზაცია, calibration session preparation, PIP (Performance Improvement Plan) შექმნა</w:t>
+      </w:r>
+    </w:p>
+    <w:p>
+      <w:pPr>
+        <w:pStyle w:val="BodyText"/>
+        <w:numPr>
+          <w:ilvl w:val="0"/>
+          <w:numId w:val="7"/>
+        </w:numPr>
+        <w:tabs>
+          <w:tab w:val="clear" w:pos="709"/>
+          <w:tab w:val="left" w:pos="709" w:leader="none"/>
+        </w:tabs>
+        <w:bidi w:val="0"/>
+        <w:ind w:hanging="283" w:start="709"/>
+        <w:jc w:val="start"/>
+        <w:rPr/>
+      </w:pPr>
+      <w:r>
+        <w:rPr/>
+        <w:t>ტრენინგი და განვითარება: skills gap ანალიზი AI-ით, პერსონალიზებული სასწავლო გეგმების შექმნა, learning path recommendation, training effectiveness measurement, career development planning</w:t>
+      </w:r>
+    </w:p>
+    <w:p>
+      <w:pPr>
+        <w:pStyle w:val="BodyText"/>
+        <w:numPr>
+          <w:ilvl w:val="0"/>
+          <w:numId w:val="7"/>
+        </w:numPr>
+        <w:tabs>
+          <w:tab w:val="clear" w:pos="709"/>
+          <w:tab w:val="left" w:pos="709" w:leader="none"/>
+        </w:tabs>
+        <w:bidi w:val="0"/>
+        <w:ind w:hanging="283" w:start="709"/>
+        <w:jc w:val="start"/>
+        <w:rPr/>
+      </w:pPr>
+      <w:r>
+        <w:rPr/>
+        <w:t>Retention და Churn Prevention: turnover prediction მოდელი, exit interview ანალიზი AI-ით, stay interview სტრატეგია, compensation benchmarking, retention action plan</w:t>
+      </w:r>
+    </w:p>
+    <w:p>
+      <w:pPr>
+        <w:pStyle w:val="BodyText"/>
+        <w:numPr>
+          <w:ilvl w:val="0"/>
+          <w:numId w:val="7"/>
+        </w:numPr>
+        <w:tabs>
+          <w:tab w:val="clear" w:pos="709"/>
+          <w:tab w:val="left" w:pos="709" w:leader="none"/>
+        </w:tabs>
+        <w:bidi w:val="0"/>
+        <w:ind w:hanging="283" w:start="709"/>
+        <w:jc w:val="start"/>
+        <w:rPr/>
+      </w:pPr>
+      <w:r>
+        <w:rPr/>
+        <w:t>HR ანალიტიკა: workforce planning მოდელები, diversity და inclusion მეტრიკების tracking, headcount forecasting, HR dashboard-ის აწყობა, data-driven HR გადაწყვეტილებები</w:t>
+      </w:r>
+    </w:p>
+    <w:p>
+      <w:pPr>
+        <w:pStyle w:val="BodyText"/>
+        <w:bidi w:val="0"/>
+        <w:jc w:val="start"/>
+        <w:rPr/>
+      </w:pPr>
+      <w:r>
+        <w:rPr/>
+        <w:t>Lesson 7: AI სტრატეგია — კონკურენტული ანალიზი და დაგეგმვა</w:t>
+      </w:r>
+    </w:p>
+    <w:p>
+      <w:pPr>
+        <w:pStyle w:val="BodyText"/>
+        <w:numPr>
+          <w:ilvl w:val="0"/>
+          <w:numId w:val="8"/>
+        </w:numPr>
+        <w:tabs>
+          <w:tab w:val="clear" w:pos="709"/>
+          <w:tab w:val="left" w:pos="709" w:leader="none"/>
+        </w:tabs>
+        <w:bidi w:val="0"/>
+        <w:ind w:hanging="283" w:start="709"/>
+        <w:jc w:val="start"/>
+        <w:rPr/>
+      </w:pPr>
+      <w:r>
+        <w:rPr/>
+        <w:t>კონკურენტული ანალიზი: Crayon/Klue-ით ავტომატური მონიტორინგი, SWOT ანალიზის ავტომატიზაცია Claude-ით, Porter's Five Forces AI-ით, competitive battlecard-ების შექმნა, win/loss ანალიზი</w:t>
+      </w:r>
+    </w:p>
+    <w:p>
+      <w:pPr>
+        <w:pStyle w:val="BodyText"/>
+        <w:numPr>
+          <w:ilvl w:val="0"/>
+          <w:numId w:val="8"/>
+        </w:numPr>
+        <w:tabs>
+          <w:tab w:val="clear" w:pos="709"/>
+          <w:tab w:val="left" w:pos="709" w:leader="none"/>
+        </w:tabs>
+        <w:bidi w:val="0"/>
+        <w:ind w:hanging="283" w:start="709"/>
+        <w:jc w:val="start"/>
+        <w:rPr/>
+      </w:pPr>
+      <w:r>
+        <w:rPr/>
+        <w:t>PESTEL ანალიზი AI-ით: პოლიტიკური, ეკონომიკური, სოციალური, ტექნოლოგიური, ეკოლოგიური, სამართლებრივი ფაქტორების სკანირება, ტრენდების პროგნოზირება, სცენარების მოდელირება, impact assessment</w:t>
+      </w:r>
+    </w:p>
+    <w:p>
+      <w:pPr>
+        <w:pStyle w:val="BodyText"/>
+        <w:numPr>
+          <w:ilvl w:val="0"/>
+          <w:numId w:val="8"/>
+        </w:numPr>
+        <w:tabs>
+          <w:tab w:val="clear" w:pos="709"/>
+          <w:tab w:val="left" w:pos="709" w:leader="none"/>
+        </w:tabs>
+        <w:bidi w:val="0"/>
+        <w:ind w:hanging="283" w:start="709"/>
+        <w:jc w:val="start"/>
+        <w:rPr/>
+      </w:pPr>
+      <w:r>
+        <w:rPr/>
+        <w:t>ბაზრის კვლევა: target market sizing AI-ით, customer persona შექმნა, market segmentation, blue ocean strategy ანალიზი, product-market fit assessment AI-ით</w:t>
+      </w:r>
+    </w:p>
+    <w:p>
+      <w:pPr>
+        <w:pStyle w:val="BodyText"/>
+        <w:numPr>
+          <w:ilvl w:val="0"/>
+          <w:numId w:val="8"/>
+        </w:numPr>
+        <w:tabs>
+          <w:tab w:val="clear" w:pos="709"/>
+          <w:tab w:val="left" w:pos="709" w:leader="none"/>
+        </w:tabs>
+        <w:bidi w:val="0"/>
+        <w:ind w:hanging="283" w:start="709"/>
+        <w:jc w:val="start"/>
+        <w:rPr/>
+      </w:pPr>
+      <w:r>
+        <w:rPr/>
+        <w:t>სტრატეგიული დაგეგმვა: 3-5 წლიანი სტრატეგიის ფრეიმვორკი, OKR-ების კასკადირება, strategic initiative prioritization, resource allocation optimization, quarterly business review preparation AI-ით</w:t>
+      </w:r>
+    </w:p>
+    <w:p>
+      <w:pPr>
+        <w:pStyle w:val="BodyText"/>
+        <w:numPr>
+          <w:ilvl w:val="0"/>
+          <w:numId w:val="8"/>
+        </w:numPr>
+        <w:tabs>
+          <w:tab w:val="clear" w:pos="709"/>
+          <w:tab w:val="left" w:pos="709" w:leader="none"/>
+        </w:tabs>
+        <w:bidi w:val="0"/>
+        <w:ind w:hanging="283" w:start="709"/>
+        <w:jc w:val="start"/>
+        <w:rPr/>
+      </w:pPr>
+      <w:r>
+        <w:rPr/>
+        <w:t>Innovation და ახალი შესაძლებლობები: emerging technology scanning, adjacent market opportunity analysis, business model innovation (Business Model Canvas + AI), partnership evaluation, go-to-market strategy</w:t>
+      </w:r>
+    </w:p>
+    <w:p>
+      <w:pPr>
+        <w:pStyle w:val="BodyText"/>
+        <w:bidi w:val="0"/>
+        <w:jc w:val="start"/>
+        <w:rPr/>
+      </w:pPr>
+      <w:r>
+        <w:rPr/>
+        <w:t>Lesson 8: AI Governance, ეთიკა და რისკების მართვა</w:t>
+      </w:r>
+    </w:p>
+    <w:p>
+      <w:pPr>
+        <w:pStyle w:val="BodyText"/>
+        <w:numPr>
+          <w:ilvl w:val="0"/>
+          <w:numId w:val="9"/>
+        </w:numPr>
+        <w:tabs>
+          <w:tab w:val="clear" w:pos="709"/>
+          <w:tab w:val="left" w:pos="709" w:leader="none"/>
+        </w:tabs>
+        <w:bidi w:val="0"/>
+        <w:ind w:hanging="283" w:start="709"/>
+        <w:jc w:val="start"/>
+        <w:rPr/>
+      </w:pPr>
+      <w:r>
+        <w:rPr/>
+        <w:t>რისკების მართვა AI-ით: რისკის მატრიცის ავტომატიზაცია (ალბათობა × გავლენა), early warning ინდიკატორების მონიტორინგი, კრიზისის სიმულაცია AI-ით, business continuity plan შექმნა, disaster recovery სცენარები</w:t>
+      </w:r>
+    </w:p>
+    <w:p>
+      <w:pPr>
+        <w:pStyle w:val="BodyText"/>
+        <w:numPr>
+          <w:ilvl w:val="0"/>
+          <w:numId w:val="9"/>
+        </w:numPr>
+        <w:tabs>
+          <w:tab w:val="clear" w:pos="709"/>
+          <w:tab w:val="left" w:pos="709" w:leader="none"/>
+        </w:tabs>
+        <w:bidi w:val="0"/>
+        <w:ind w:hanging="283" w:start="709"/>
+        <w:jc w:val="start"/>
+        <w:rPr/>
+      </w:pPr>
+      <w:r>
+        <w:rPr/>
+        <w:t>AI სტრატეგიის როუდმეპი: კომპანიის AI მზადყოფნის შეფასება (assessment framework), 90-დღიანი სამოქმედო გეგმა, ბიუჯეტის დაგეგმვა, KPI-ების განსაზღვრა, ცვლილებების მართვა გუნდში</w:t>
+      </w:r>
+    </w:p>
+    <w:p>
+      <w:pPr>
+        <w:pStyle w:val="BodyText"/>
+        <w:numPr>
+          <w:ilvl w:val="0"/>
+          <w:numId w:val="9"/>
+        </w:numPr>
+        <w:tabs>
+          <w:tab w:val="clear" w:pos="709"/>
+          <w:tab w:val="left" w:pos="709" w:leader="none"/>
+        </w:tabs>
+        <w:bidi w:val="0"/>
+        <w:ind w:hanging="283" w:start="709"/>
+        <w:jc w:val="start"/>
+        <w:rPr/>
+      </w:pPr>
+      <w:r>
+        <w:rPr/>
+        <w:t>AI ეთიკური ჩარჩო: AI-ის პასუხისმგებლიანი გამოყენების პოლიტიკის შექმნა (შაბლონი), approved tools list, data handling guidelines, bias detection და prevention, transparency სტანდარტები</w:t>
+      </w:r>
+    </w:p>
+    <w:p>
+      <w:pPr>
+        <w:pStyle w:val="BodyText"/>
+        <w:numPr>
+          <w:ilvl w:val="0"/>
+          <w:numId w:val="9"/>
+        </w:numPr>
+        <w:tabs>
+          <w:tab w:val="clear" w:pos="709"/>
+          <w:tab w:val="left" w:pos="709" w:leader="none"/>
+        </w:tabs>
+        <w:bidi w:val="0"/>
+        <w:ind w:hanging="283" w:start="709"/>
+        <w:jc w:val="start"/>
+        <w:rPr/>
+      </w:pPr>
+      <w:r>
+        <w:rPr/>
+        <w:t>რეგულაციები და compliance: GDPR მოთხოვნები AI-სთვის, EU AI Act-ის გავლენა, მონაცემთა კონფიდენციალობის audit, vendor risk assessment, data processing agreements AI მომწოდებლებთან</w:t>
+      </w:r>
+    </w:p>
+    <w:p>
+      <w:pPr>
+        <w:pStyle w:val="BodyText"/>
+        <w:numPr>
+          <w:ilvl w:val="0"/>
+          <w:numId w:val="9"/>
+        </w:numPr>
+        <w:tabs>
+          <w:tab w:val="clear" w:pos="709"/>
+          <w:tab w:val="left" w:pos="709" w:leader="none"/>
+        </w:tabs>
+        <w:bidi w:val="0"/>
+        <w:ind w:hanging="283" w:start="709"/>
+        <w:jc w:val="start"/>
+        <w:rPr/>
+      </w:pPr>
+      <w:r>
+        <w:rPr/>
+        <w:t>ცვლილებების მართვის პრაქტიკა: გუნდის წინააღმდეგობის დაძლევა, AI champions program-ის აწყობა, training program დიზაინი, internal communication strategy, success stories-ის დოკუმენტაცია, scaling framework</w:t>
       </w:r>
     </w:p>
     <w:p>
@@ -1296,6 +1647,417 @@
     </w:lvl>
   </w:abstractNum>
   <w:abstractNum w:abstractNumId="6">
+    <w:lvl w:ilvl="0">
+      <w:start w:val="1"/>
+      <w:numFmt w:val="bullet"/>
+      <w:lvlText w:val=""/>
+      <w:lvlJc w:val="start"/>
+      <w:pPr>
+        <w:tabs>
+          <w:tab w:val="num" w:pos="709"/>
+        </w:tabs>
+        <w:ind w:start="709" w:hanging="283"/>
+      </w:pPr>
+      <w:rPr>
+        <w:rFonts w:ascii="Symbol" w:hAnsi="Symbol" w:cs="Symbol" w:hint="default"/>
+      </w:rPr>
+    </w:lvl>
+    <w:lvl w:ilvl="1">
+      <w:start w:val="1"/>
+      <w:numFmt w:val="bullet"/>
+      <w:lvlText w:val=""/>
+      <w:lvlJc w:val="start"/>
+      <w:pPr>
+        <w:tabs>
+          <w:tab w:val="num" w:pos="1418"/>
+        </w:tabs>
+        <w:ind w:start="1418" w:hanging="283"/>
+      </w:pPr>
+      <w:rPr>
+        <w:rFonts w:ascii="Symbol" w:hAnsi="Symbol" w:cs="Symbol" w:hint="default"/>
+      </w:rPr>
+    </w:lvl>
+    <w:lvl w:ilvl="2">
+      <w:start w:val="1"/>
+      <w:numFmt w:val="bullet"/>
+      <w:lvlText w:val=""/>
+      <w:lvlJc w:val="start"/>
+      <w:pPr>
+        <w:tabs>
+          <w:tab w:val="num" w:pos="2127"/>
+        </w:tabs>
+        <w:ind w:start="2127" w:hanging="283"/>
+      </w:pPr>
+      <w:rPr>
+        <w:rFonts w:ascii="Symbol" w:hAnsi="Symbol" w:cs="Symbol" w:hint="default"/>
+      </w:rPr>
+    </w:lvl>
+    <w:lvl w:ilvl="3">
+      <w:start w:val="1"/>
+      <w:numFmt w:val="bullet"/>
+      <w:lvlText w:val=""/>
+      <w:lvlJc w:val="start"/>
+      <w:pPr>
+        <w:tabs>
+          <w:tab w:val="num" w:pos="2836"/>
+        </w:tabs>
+        <w:ind w:start="2836" w:hanging="283"/>
+      </w:pPr>
+      <w:rPr>
+        <w:rFonts w:ascii="Symbol" w:hAnsi="Symbol" w:cs="Symbol" w:hint="default"/>
+      </w:rPr>
+    </w:lvl>
+    <w:lvl w:ilvl="4">
+      <w:start w:val="1"/>
+      <w:numFmt w:val="bullet"/>
+      <w:lvlText w:val=""/>
+      <w:lvlJc w:val="start"/>
+      <w:pPr>
+        <w:tabs>
+          <w:tab w:val="num" w:pos="3545"/>
+        </w:tabs>
+        <w:ind w:start="3545" w:hanging="283"/>
+      </w:pPr>
+      <w:rPr>
+        <w:rFonts w:ascii="Symbol" w:hAnsi="Symbol" w:cs="Symbol" w:hint="default"/>
+      </w:rPr>
+    </w:lvl>
+    <w:lvl w:ilvl="5">
+      <w:start w:val="1"/>
+      <w:numFmt w:val="bullet"/>
+      <w:lvlText w:val=""/>
+      <w:lvlJc w:val="start"/>
+      <w:pPr>
+        <w:tabs>
+          <w:tab w:val="num" w:pos="4254"/>
+        </w:tabs>
+        <w:ind w:start="4254" w:hanging="283"/>
+      </w:pPr>
+      <w:rPr>
+        <w:rFonts w:ascii="Symbol" w:hAnsi="Symbol" w:cs="Symbol" w:hint="default"/>
+      </w:rPr>
+    </w:lvl>
+    <w:lvl w:ilvl="6">
+      <w:start w:val="1"/>
+      <w:numFmt w:val="bullet"/>
+      <w:lvlText w:val=""/>
+      <w:lvlJc w:val="start"/>
+      <w:pPr>
+        <w:tabs>
+          <w:tab w:val="num" w:pos="4963"/>
+        </w:tabs>
+        <w:ind w:start="4963" w:hanging="283"/>
+      </w:pPr>
+      <w:rPr>
+        <w:rFonts w:ascii="Symbol" w:hAnsi="Symbol" w:cs="Symbol" w:hint="default"/>
+      </w:rPr>
+    </w:lvl>
+    <w:lvl w:ilvl="7">
+      <w:start w:val="1"/>
+      <w:numFmt w:val="bullet"/>
+      <w:lvlText w:val=""/>
+      <w:lvlJc w:val="start"/>
+      <w:pPr>
+        <w:tabs>
+          <w:tab w:val="num" w:pos="5672"/>
+        </w:tabs>
+        <w:ind w:start="5672" w:hanging="283"/>
+      </w:pPr>
+      <w:rPr>
+        <w:rFonts w:ascii="Symbol" w:hAnsi="Symbol" w:cs="Symbol" w:hint="default"/>
+      </w:rPr>
+    </w:lvl>
+    <w:lvl w:ilvl="8">
+      <w:start w:val="1"/>
+      <w:numFmt w:val="bullet"/>
+      <w:lvlText w:val=""/>
+      <w:lvlJc w:val="start"/>
+      <w:pPr>
+        <w:tabs>
+          <w:tab w:val="num" w:pos="6381"/>
+        </w:tabs>
+        <w:ind w:start="6381" w:hanging="283"/>
+      </w:pPr>
+      <w:rPr>
+        <w:rFonts w:ascii="Symbol" w:hAnsi="Symbol" w:cs="Symbol" w:hint="default"/>
+      </w:rPr>
+    </w:lvl>
+  </w:abstractNum>
+  <w:abstractNum w:abstractNumId="7">
+    <w:lvl w:ilvl="0">
+      <w:start w:val="1"/>
+      <w:numFmt w:val="bullet"/>
+      <w:lvlText w:val=""/>
+      <w:lvlJc w:val="start"/>
+      <w:pPr>
+        <w:tabs>
+          <w:tab w:val="num" w:pos="709"/>
+        </w:tabs>
+        <w:ind w:start="709" w:hanging="283"/>
+      </w:pPr>
+      <w:rPr>
+        <w:rFonts w:ascii="Symbol" w:hAnsi="Symbol" w:cs="Symbol" w:hint="default"/>
+      </w:rPr>
+    </w:lvl>
+    <w:lvl w:ilvl="1">
+      <w:start w:val="1"/>
+      <w:numFmt w:val="bullet"/>
+      <w:lvlText w:val=""/>
+      <w:lvlJc w:val="start"/>
+      <w:pPr>
+        <w:tabs>
+          <w:tab w:val="num" w:pos="1418"/>
+        </w:tabs>
+        <w:ind w:start="1418" w:hanging="283"/>
+      </w:pPr>
+      <w:rPr>
+        <w:rFonts w:ascii="Symbol" w:hAnsi="Symbol" w:cs="Symbol" w:hint="default"/>
+      </w:rPr>
+    </w:lvl>
+    <w:lvl w:ilvl="2">
+      <w:start w:val="1"/>
+      <w:numFmt w:val="bullet"/>
+      <w:lvlText w:val=""/>
+      <w:lvlJc w:val="start"/>
+      <w:pPr>
+        <w:tabs>
+          <w:tab w:val="num" w:pos="2127"/>
+        </w:tabs>
+        <w:ind w:start="2127" w:hanging="283"/>
+      </w:pPr>
+      <w:rPr>
+        <w:rFonts w:ascii="Symbol" w:hAnsi="Symbol" w:cs="Symbol" w:hint="default"/>
+      </w:rPr>
+    </w:lvl>
+    <w:lvl w:ilvl="3">
+      <w:start w:val="1"/>
+      <w:numFmt w:val="bullet"/>
+      <w:lvlText w:val=""/>
+      <w:lvlJc w:val="start"/>
+      <w:pPr>
+        <w:tabs>
+          <w:tab w:val="num" w:pos="2836"/>
+        </w:tabs>
+        <w:ind w:start="2836" w:hanging="283"/>
+      </w:pPr>
+      <w:rPr>
+        <w:rFonts w:ascii="Symbol" w:hAnsi="Symbol" w:cs="Symbol" w:hint="default"/>
+      </w:rPr>
+    </w:lvl>
+    <w:lvl w:ilvl="4">
+      <w:start w:val="1"/>
+      <w:numFmt w:val="bullet"/>
+      <w:lvlText w:val=""/>
+      <w:lvlJc w:val="start"/>
+      <w:pPr>
+        <w:tabs>
+          <w:tab w:val="num" w:pos="3545"/>
+        </w:tabs>
+        <w:ind w:start="3545" w:hanging="283"/>
+      </w:pPr>
+      <w:rPr>
+        <w:rFonts w:ascii="Symbol" w:hAnsi="Symbol" w:cs="Symbol" w:hint="default"/>
+      </w:rPr>
+    </w:lvl>
+    <w:lvl w:ilvl="5">
+      <w:start w:val="1"/>
+      <w:numFmt w:val="bullet"/>
+      <w:lvlText w:val=""/>
+      <w:lvlJc w:val="start"/>
+      <w:pPr>
+        <w:tabs>
+          <w:tab w:val="num" w:pos="4254"/>
+        </w:tabs>
+        <w:ind w:start="4254" w:hanging="283"/>
+      </w:pPr>
+      <w:rPr>
+        <w:rFonts w:ascii="Symbol" w:hAnsi="Symbol" w:cs="Symbol" w:hint="default"/>
+      </w:rPr>
+    </w:lvl>
+    <w:lvl w:ilvl="6">
+      <w:start w:val="1"/>
+      <w:numFmt w:val="bullet"/>
+      <w:lvlText w:val=""/>
+      <w:lvlJc w:val="start"/>
+      <w:pPr>
+        <w:tabs>
+          <w:tab w:val="num" w:pos="4963"/>
+        </w:tabs>
+        <w:ind w:start="4963" w:hanging="283"/>
+      </w:pPr>
+      <w:rPr>
+        <w:rFonts w:ascii="Symbol" w:hAnsi="Symbol" w:cs="Symbol" w:hint="default"/>
+      </w:rPr>
+    </w:lvl>
+    <w:lvl w:ilvl="7">
+      <w:start w:val="1"/>
+      <w:numFmt w:val="bullet"/>
+      <w:lvlText w:val=""/>
+      <w:lvlJc w:val="start"/>
+      <w:pPr>
+        <w:tabs>
+          <w:tab w:val="num" w:pos="5672"/>
+        </w:tabs>
+        <w:ind w:start="5672" w:hanging="283"/>
+      </w:pPr>
+      <w:rPr>
+        <w:rFonts w:ascii="Symbol" w:hAnsi="Symbol" w:cs="Symbol" w:hint="default"/>
+      </w:rPr>
+    </w:lvl>
+    <w:lvl w:ilvl="8">
+      <w:start w:val="1"/>
+      <w:numFmt w:val="bullet"/>
+      <w:lvlText w:val=""/>
+      <w:lvlJc w:val="start"/>
+      <w:pPr>
+        <w:tabs>
+          <w:tab w:val="num" w:pos="6381"/>
+        </w:tabs>
+        <w:ind w:start="6381" w:hanging="283"/>
+      </w:pPr>
+      <w:rPr>
+        <w:rFonts w:ascii="Symbol" w:hAnsi="Symbol" w:cs="Symbol" w:hint="default"/>
+      </w:rPr>
+    </w:lvl>
+  </w:abstractNum>
+  <w:abstractNum w:abstractNumId="8">
+    <w:lvl w:ilvl="0">
+      <w:start w:val="1"/>
+      <w:numFmt w:val="bullet"/>
+      <w:lvlText w:val=""/>
+      <w:lvlJc w:val="start"/>
+      <w:pPr>
+        <w:tabs>
+          <w:tab w:val="num" w:pos="709"/>
+        </w:tabs>
+        <w:ind w:start="709" w:hanging="283"/>
+      </w:pPr>
+      <w:rPr>
+        <w:rFonts w:ascii="Symbol" w:hAnsi="Symbol" w:cs="Symbol" w:hint="default"/>
+      </w:rPr>
+    </w:lvl>
+    <w:lvl w:ilvl="1">
+      <w:start w:val="1"/>
+      <w:numFmt w:val="bullet"/>
+      <w:lvlText w:val=""/>
+      <w:lvlJc w:val="start"/>
+      <w:pPr>
+        <w:tabs>
+          <w:tab w:val="num" w:pos="1418"/>
+        </w:tabs>
+        <w:ind w:start="1418" w:hanging="283"/>
+      </w:pPr>
+      <w:rPr>
+        <w:rFonts w:ascii="Symbol" w:hAnsi="Symbol" w:cs="Symbol" w:hint="default"/>
+      </w:rPr>
+    </w:lvl>
+    <w:lvl w:ilvl="2">
+      <w:start w:val="1"/>
+      <w:numFmt w:val="bullet"/>
+      <w:lvlText w:val=""/>
+      <w:lvlJc w:val="start"/>
+      <w:pPr>
+        <w:tabs>
+          <w:tab w:val="num" w:pos="2127"/>
+        </w:tabs>
+        <w:ind w:start="2127" w:hanging="283"/>
+      </w:pPr>
+      <w:rPr>
+        <w:rFonts w:ascii="Symbol" w:hAnsi="Symbol" w:cs="Symbol" w:hint="default"/>
+      </w:rPr>
+    </w:lvl>
+    <w:lvl w:ilvl="3">
+      <w:start w:val="1"/>
+      <w:numFmt w:val="bullet"/>
+      <w:lvlText w:val=""/>
+      <w:lvlJc w:val="start"/>
+      <w:pPr>
+        <w:tabs>
+          <w:tab w:val="num" w:pos="2836"/>
+        </w:tabs>
+        <w:ind w:start="2836" w:hanging="283"/>
+      </w:pPr>
+      <w:rPr>
+        <w:rFonts w:ascii="Symbol" w:hAnsi="Symbol" w:cs="Symbol" w:hint="default"/>
+      </w:rPr>
+    </w:lvl>
+    <w:lvl w:ilvl="4">
+      <w:start w:val="1"/>
+      <w:numFmt w:val="bullet"/>
+      <w:lvlText w:val=""/>
+      <w:lvlJc w:val="start"/>
+      <w:pPr>
+        <w:tabs>
+          <w:tab w:val="num" w:pos="3545"/>
+        </w:tabs>
+        <w:ind w:start="3545" w:hanging="283"/>
+      </w:pPr>
+      <w:rPr>
+        <w:rFonts w:ascii="Symbol" w:hAnsi="Symbol" w:cs="Symbol" w:hint="default"/>
+      </w:rPr>
+    </w:lvl>
+    <w:lvl w:ilvl="5">
+      <w:start w:val="1"/>
+      <w:numFmt w:val="bullet"/>
+      <w:lvlText w:val=""/>
+      <w:lvlJc w:val="start"/>
+      <w:pPr>
+        <w:tabs>
+          <w:tab w:val="num" w:pos="4254"/>
+        </w:tabs>
+        <w:ind w:start="4254" w:hanging="283"/>
+      </w:pPr>
+      <w:rPr>
+        <w:rFonts w:ascii="Symbol" w:hAnsi="Symbol" w:cs="Symbol" w:hint="default"/>
+      </w:rPr>
+    </w:lvl>
+    <w:lvl w:ilvl="6">
+      <w:start w:val="1"/>
+      <w:numFmt w:val="bullet"/>
+      <w:lvlText w:val=""/>
+      <w:lvlJc w:val="start"/>
+      <w:pPr>
+        <w:tabs>
+          <w:tab w:val="num" w:pos="4963"/>
+        </w:tabs>
+        <w:ind w:start="4963" w:hanging="283"/>
+      </w:pPr>
+      <w:rPr>
+        <w:rFonts w:ascii="Symbol" w:hAnsi="Symbol" w:cs="Symbol" w:hint="default"/>
+      </w:rPr>
+    </w:lvl>
+    <w:lvl w:ilvl="7">
+      <w:start w:val="1"/>
+      <w:numFmt w:val="bullet"/>
+      <w:lvlText w:val=""/>
+      <w:lvlJc w:val="start"/>
+      <w:pPr>
+        <w:tabs>
+          <w:tab w:val="num" w:pos="5672"/>
+        </w:tabs>
+        <w:ind w:start="5672" w:hanging="283"/>
+      </w:pPr>
+      <w:rPr>
+        <w:rFonts w:ascii="Symbol" w:hAnsi="Symbol" w:cs="Symbol" w:hint="default"/>
+      </w:rPr>
+    </w:lvl>
+    <w:lvl w:ilvl="8">
+      <w:start w:val="1"/>
+      <w:numFmt w:val="bullet"/>
+      <w:lvlText w:val=""/>
+      <w:lvlJc w:val="start"/>
+      <w:pPr>
+        <w:tabs>
+          <w:tab w:val="num" w:pos="6381"/>
+        </w:tabs>
+        <w:ind w:start="6381" w:hanging="283"/>
+      </w:pPr>
+      <w:rPr>
+        <w:rFonts w:ascii="Symbol" w:hAnsi="Symbol" w:cs="Symbol" w:hint="default"/>
+      </w:rPr>
+    </w:lvl>
+  </w:abstractNum>
+  <w:abstractNum w:abstractNumId="9">
     <w:lvl w:ilvl="0">
       <w:start w:val="1"/>
       <w:numFmt w:val="bullet"/>
@@ -1449,6 +2211,15 @@
   </w:num>
   <w:num w:numId="6">
     <w:abstractNumId w:val="6"/>
+  </w:num>
+  <w:num w:numId="7">
+    <w:abstractNumId w:val="7"/>
+  </w:num>
+  <w:num w:numId="8">
+    <w:abstractNumId w:val="8"/>
+  </w:num>
+  <w:num w:numId="9">
+    <w:abstractNumId w:val="9"/>
   </w:num>
 </w:numbering>
 </file>

</xml_diff>